<commit_message>
created displayCart method in Shop Class
</commit_message>
<xml_diff>
--- a/Spécifications Fonctionnelles.docx
+++ b/Spécifications Fonctionnelles.docx
@@ -21,7 +21,7 @@
         </w:numPr>
       </w:pPr>
       <w:r>
-        <w:t>Afficher par défaut la liste des cours disponibles dans une ordre aléatoire</w:t>
+        <w:t>Afficher par défaut la liste des cours disponibles</w:t>
       </w:r>
     </w:p>
     <w:p>
@@ -179,7 +179,7 @@
         </w:numPr>
       </w:pPr>
       <w:r>
-        <w:t xml:space="preserve">Se connecter </w:t>
+        <w:t>Il peut acheter</w:t>
       </w:r>
     </w:p>
     <w:p>

</xml_diff>